<commit_message>
edit invitation (docx and pdf)
</commit_message>
<xml_diff>
--- a/documents/invite50.docx
+++ b/documents/invite50.docx
@@ -363,9 +363,17 @@
       </w:r>
       <w:r>
         <w:rPr>
-          <w:sz w:val="23"/>
-        </w:rPr>
-        <w:t xml:space="preserve">6:00 pm – 10:00 </w:t>
+          <w:bCs/>
+          <w:color w:val="791D2B"/>
+          <w:sz w:val="23"/>
+        </w:rPr>
+        <w:t>5</w:t>
+      </w:r>
+      <w:r>
+        <w:rPr>
+          <w:sz w:val="23"/>
+        </w:rPr>
+        <w:t xml:space="preserve">:00 pm – 10:00 </w:t>
       </w:r>
       <w:r>
         <w:rPr>
@@ -958,56 +966,352 @@
         <w:spacing w:before="219" w:line="271" w:lineRule="auto"/>
         <w:ind w:left="160"/>
         <w:rPr>
+          <w:noProof/>
+        </w:rPr>
+      </w:pPr>
+      <w:r>
+        <w:rPr>
           <w:b/>
-          <w:sz w:val="23"/>
-        </w:rPr>
-      </w:pPr>
-      <w:r>
-        <w:rPr>
           <w:noProof/>
-        </w:rPr>
-        <w:drawing>
-          <wp:inline distT="0" distB="0" distL="0" distR="0" wp14:anchorId="146EA885" wp14:editId="7443C48A">
-            <wp:extent cx="593443" cy="821690"/>
-            <wp:effectExtent l="0" t="0" r="3810" b="3810"/>
-            <wp:docPr id="567655280" name="Picture 1" descr="A qr code with purple text&#10;&#10;AI-generated content may be incorrect."/>
-            <wp:cNvGraphicFramePr>
-              <a:graphicFrameLocks xmlns:a="http://schemas.openxmlformats.org/drawingml/2006/main" noChangeAspect="1"/>
-            </wp:cNvGraphicFramePr>
-            <a:graphic xmlns:a="http://schemas.openxmlformats.org/drawingml/2006/main">
-              <a:graphicData uri="http://schemas.openxmlformats.org/drawingml/2006/picture">
-                <pic:pic xmlns:pic="http://schemas.openxmlformats.org/drawingml/2006/picture">
-                  <pic:nvPicPr>
-                    <pic:cNvPr id="842242424" name="Picture 1" descr="A qr code with purple text&#10;&#10;AI-generated content may be incorrect."/>
-                    <pic:cNvPicPr/>
-                  </pic:nvPicPr>
-                  <pic:blipFill>
-                    <a:blip r:embed="rId5" cstate="print">
-                      <a:extLst>
-                        <a:ext uri="{28A0092B-C50C-407E-A947-70E740481C1C}">
-                          <a14:useLocalDpi xmlns:a14="http://schemas.microsoft.com/office/drawing/2010/main" val="0"/>
-                        </a:ext>
-                      </a:extLst>
-                    </a:blip>
-                    <a:stretch>
-                      <a:fillRect/>
-                    </a:stretch>
-                  </pic:blipFill>
-                  <pic:spPr>
-                    <a:xfrm>
-                      <a:off x="0" y="0"/>
-                      <a:ext cx="608225" cy="842157"/>
-                    </a:xfrm>
-                    <a:prstGeom prst="rect">
-                      <a:avLst/>
-                    </a:prstGeom>
-                  </pic:spPr>
-                </pic:pic>
-              </a:graphicData>
-            </a:graphic>
-          </wp:inline>
-        </w:drawing>
-      </w:r>
+          <w:sz w:val="23"/>
+        </w:rPr>
+        <mc:AlternateContent>
+          <mc:Choice Requires="wps">
+            <w:drawing>
+              <wp:anchor distT="45720" distB="45720" distL="114300" distR="114300" simplePos="0" relativeHeight="251658752" behindDoc="0" locked="0" layoutInCell="1" allowOverlap="1" wp14:anchorId="7C855C13" wp14:editId="5AFFC6DF">
+                <wp:simplePos x="0" y="0"/>
+                <wp:positionH relativeFrom="column">
+                  <wp:posOffset>3609975</wp:posOffset>
+                </wp:positionH>
+                <wp:positionV relativeFrom="paragraph">
+                  <wp:posOffset>269240</wp:posOffset>
+                </wp:positionV>
+                <wp:extent cx="1771650" cy="964565"/>
+                <wp:effectExtent l="0" t="0" r="19050" b="26035"/>
+                <wp:wrapSquare wrapText="bothSides"/>
+                <wp:docPr id="217" name="Text Box 2"/>
+                <wp:cNvGraphicFramePr>
+                  <a:graphicFrameLocks xmlns:a="http://schemas.openxmlformats.org/drawingml/2006/main"/>
+                </wp:cNvGraphicFramePr>
+                <a:graphic xmlns:a="http://schemas.openxmlformats.org/drawingml/2006/main">
+                  <a:graphicData uri="http://schemas.microsoft.com/office/word/2010/wordprocessingShape">
+                    <wps:wsp>
+                      <wps:cNvSpPr txBox="1">
+                        <a:spLocks noChangeArrowheads="1"/>
+                      </wps:cNvSpPr>
+                      <wps:spPr bwMode="auto">
+                        <a:xfrm>
+                          <a:off x="0" y="0"/>
+                          <a:ext cx="1771650" cy="964565"/>
+                        </a:xfrm>
+                        <a:prstGeom prst="rect">
+                          <a:avLst/>
+                        </a:prstGeom>
+                        <a:solidFill>
+                          <a:srgbClr val="FFFFFF"/>
+                        </a:solidFill>
+                        <a:ln w="9525">
+                          <a:solidFill>
+                            <a:srgbClr val="000000"/>
+                          </a:solidFill>
+                          <a:miter lim="800000"/>
+                          <a:headEnd/>
+                          <a:tailEnd/>
+                        </a:ln>
+                      </wps:spPr>
+                      <wps:txbx>
+                        <w:txbxContent>
+                          <w:p>
+                            <w:r>
+                              <w:t>Address for checks:</w:t>
+                            </w:r>
+                          </w:p>
+                          <w:p/>
+                          <w:p>
+                            <w:r>
+                              <w:t>Golden High Class of ‘76</w:t>
+                            </w:r>
+                          </w:p>
+                          <w:p>
+                            <w:r>
+                              <w:t>269 Gardenia Ct.</w:t>
+                            </w:r>
+                          </w:p>
+                          <w:p>
+                            <w:r>
+                              <w:t>Golden, CO 80402</w:t>
+                            </w:r>
+                          </w:p>
+                        </w:txbxContent>
+                      </wps:txbx>
+                      <wps:bodyPr rot="0" vert="horz" wrap="square" lIns="91440" tIns="45720" rIns="91440" bIns="45720" anchor="t" anchorCtr="0">
+                        <a:noAutofit/>
+                      </wps:bodyPr>
+                    </wps:wsp>
+                  </a:graphicData>
+                </a:graphic>
+                <wp14:sizeRelH relativeFrom="margin">
+                  <wp14:pctWidth>0</wp14:pctWidth>
+                </wp14:sizeRelH>
+                <wp14:sizeRelV relativeFrom="margin">
+                  <wp14:pctHeight>0</wp14:pctHeight>
+                </wp14:sizeRelV>
+              </wp:anchor>
+            </w:drawing>
+          </mc:Choice>
+          <mc:Fallback>
+            <w:pict>
+              <v:shape w14:anchorId="7C855C13" id="Text Box 2" o:spid="_x0000_s1027" type="#_x0000_t202" style="position:absolute;left:0;text-align:left;margin-left:284.25pt;margin-top:21.2pt;width:139.5pt;height:75.95pt;z-index:251658752;visibility:visible;mso-wrap-style:square;mso-width-percent:0;mso-height-percent:0;mso-wrap-distance-left:9pt;mso-wrap-distance-top:3.6pt;mso-wrap-distance-right:9pt;mso-wrap-distance-bottom:3.6pt;mso-position-horizontal:absolute;mso-position-horizontal-relative:text;mso-position-vertical:absolute;mso-position-vertical-relative:text;mso-width-percent:0;mso-height-percent:0;mso-width-relative:margin;mso-height-relative:margin;v-text-anchor:top" o:gfxdata="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">
+                <v:textbox>
+                  <w:txbxContent>
+                    <w:p>
+                      <w:r>
+                        <w:t>Address for checks:</w:t>
+                      </w:r>
+                    </w:p>
+                    <w:p/>
+                    <w:p>
+                      <w:r>
+                        <w:t>Golden High Class of ‘76</w:t>
+                      </w:r>
+                    </w:p>
+                    <w:p>
+                      <w:r>
+                        <w:t>269 Gardenia Ct.</w:t>
+                      </w:r>
+                    </w:p>
+                    <w:p>
+                      <w:r>
+                        <w:t>Golden, CO 80402</w:t>
+                      </w:r>
+                    </w:p>
+                  </w:txbxContent>
+                </v:textbox>
+                <w10:wrap type="square"/>
+              </v:shape>
+            </w:pict>
+          </mc:Fallback>
+        </mc:AlternateContent>
+      </w:r>
+      <w:r>
+        <w:rPr>
+          <w:b/>
+          <w:noProof/>
+          <w:sz w:val="23"/>
+        </w:rPr>
+        <mc:AlternateContent>
+          <mc:Choice Requires="wps">
+            <w:drawing>
+              <wp:anchor distT="45720" distB="45720" distL="114300" distR="114300" simplePos="0" relativeHeight="251672064" behindDoc="0" locked="0" layoutInCell="1" allowOverlap="1" wp14:anchorId="005DB03D" wp14:editId="34F7911A">
+                <wp:simplePos x="0" y="0"/>
+                <wp:positionH relativeFrom="column">
+                  <wp:posOffset>1057275</wp:posOffset>
+                </wp:positionH>
+                <wp:positionV relativeFrom="paragraph">
+                  <wp:posOffset>126365</wp:posOffset>
+                </wp:positionV>
+                <wp:extent cx="1362075" cy="1276350"/>
+                <wp:effectExtent l="0" t="0" r="28575" b="19050"/>
+                <wp:wrapSquare wrapText="bothSides"/>
+                <wp:docPr id="492374582" name="Text Box 2"/>
+                <wp:cNvGraphicFramePr>
+                  <a:graphicFrameLocks xmlns:a="http://schemas.openxmlformats.org/drawingml/2006/main"/>
+                </wp:cNvGraphicFramePr>
+                <a:graphic xmlns:a="http://schemas.openxmlformats.org/drawingml/2006/main">
+                  <a:graphicData uri="http://schemas.microsoft.com/office/word/2010/wordprocessingShape">
+                    <wps:wsp>
+                      <wps:cNvSpPr txBox="1">
+                        <a:spLocks noChangeArrowheads="1"/>
+                      </wps:cNvSpPr>
+                      <wps:spPr bwMode="auto">
+                        <a:xfrm>
+                          <a:off x="0" y="0"/>
+                          <a:ext cx="1362075" cy="1276350"/>
+                        </a:xfrm>
+                        <a:prstGeom prst="rect">
+                          <a:avLst/>
+                        </a:prstGeom>
+                        <a:solidFill>
+                          <a:srgbClr val="FFFFFF"/>
+                        </a:solidFill>
+                        <a:ln w="9525">
+                          <a:solidFill>
+                            <a:srgbClr val="000000"/>
+                          </a:solidFill>
+                          <a:miter lim="800000"/>
+                          <a:headEnd/>
+                          <a:tailEnd/>
+                        </a:ln>
+                      </wps:spPr>
+                      <wps:txbx>
+                        <w:txbxContent>
+                          <w:p>
+                            <w:r>
+                              <w:t>QR code for Zelle:</w:t>
+                            </w:r>
+                          </w:p>
+                          <w:p/>
+                          <w:p>
+                            <w:r>
+                              <w:rPr>
+                                <w:noProof/>
+                              </w:rPr>
+                              <w:drawing>
+                                <wp:inline distT="0" distB="0" distL="0" distR="0" wp14:anchorId="3643B62A" wp14:editId="5EB0492A">
+                                  <wp:extent cx="593443" cy="821690"/>
+                                  <wp:effectExtent l="0" t="0" r="3810" b="3810"/>
+                                  <wp:docPr id="1820593160" name="Picture 1" descr="A qr code with purple text&#10;&#10;AI-generated content may be incorrect."/>
+                                  <wp:cNvGraphicFramePr>
+                                    <a:graphicFrameLocks xmlns:a="http://schemas.openxmlformats.org/drawingml/2006/main" noChangeAspect="1"/>
+                                  </wp:cNvGraphicFramePr>
+                                  <a:graphic xmlns:a="http://schemas.openxmlformats.org/drawingml/2006/main">
+                                    <a:graphicData uri="http://schemas.openxmlformats.org/drawingml/2006/picture">
+                                      <pic:pic xmlns:pic="http://schemas.openxmlformats.org/drawingml/2006/picture">
+                                        <pic:nvPicPr>
+                                          <pic:cNvPr id="842242424" name="Picture 1" descr="A qr code with purple text&#10;&#10;AI-generated content may be incorrect."/>
+                                          <pic:cNvPicPr/>
+                                        </pic:nvPicPr>
+                                        <pic:blipFill>
+                                          <a:blip r:embed="rId5" cstate="print">
+                                            <a:extLst>
+                                              <a:ext uri="{28A0092B-C50C-407E-A947-70E740481C1C}">
+                                                <a14:useLocalDpi xmlns:a14="http://schemas.microsoft.com/office/drawing/2010/main" val="0"/>
+                                              </a:ext>
+                                            </a:extLst>
+                                          </a:blip>
+                                          <a:stretch>
+                                            <a:fillRect/>
+                                          </a:stretch>
+                                        </pic:blipFill>
+                                        <pic:spPr>
+                                          <a:xfrm>
+                                            <a:off x="0" y="0"/>
+                                            <a:ext cx="608225" cy="842157"/>
+                                          </a:xfrm>
+                                          <a:prstGeom prst="rect">
+                                            <a:avLst/>
+                                          </a:prstGeom>
+                                        </pic:spPr>
+                                      </pic:pic>
+                                    </a:graphicData>
+                                  </a:graphic>
+                                </wp:inline>
+                              </w:drawing>
+                            </w:r>
+                          </w:p>
+                        </w:txbxContent>
+                      </wps:txbx>
+                      <wps:bodyPr rot="0" vert="horz" wrap="square" lIns="91440" tIns="45720" rIns="91440" bIns="45720" anchor="t" anchorCtr="0">
+                        <a:noAutofit/>
+                      </wps:bodyPr>
+                    </wps:wsp>
+                  </a:graphicData>
+                </a:graphic>
+                <wp14:sizeRelH relativeFrom="margin">
+                  <wp14:pctWidth>0</wp14:pctWidth>
+                </wp14:sizeRelH>
+                <wp14:sizeRelV relativeFrom="margin">
+                  <wp14:pctHeight>0</wp14:pctHeight>
+                </wp14:sizeRelV>
+              </wp:anchor>
+            </w:drawing>
+          </mc:Choice>
+          <mc:Fallback>
+            <w:pict>
+              <v:shape w14:anchorId="005DB03D" id="_x0000_s1028" type="#_x0000_t202" style="position:absolute;left:0;text-align:left;margin-left:83.25pt;margin-top:9.95pt;width:107.25pt;height:100.5pt;z-index:251672064;visibility:visible;mso-wrap-style:square;mso-width-percent:0;mso-height-percent:0;mso-wrap-distance-left:9pt;mso-wrap-distance-top:3.6pt;mso-wrap-distance-right:9pt;mso-wrap-distance-bottom:3.6pt;mso-position-horizontal:absolute;mso-position-horizontal-relative:text;mso-position-vertical:absolute;mso-position-vertical-relative:text;mso-width-percent:0;mso-height-percent:0;mso-width-relative:margin;mso-height-relative:margin;v-text-anchor:top" o:gfxdata="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">
+                <v:textbox>
+                  <w:txbxContent>
+                    <w:p>
+                      <w:r>
+                        <w:t>QR code for Zelle:</w:t>
+                      </w:r>
+                    </w:p>
+                    <w:p/>
+                    <w:p>
+                      <w:r>
+                        <w:rPr>
+                          <w:noProof/>
+                        </w:rPr>
+                        <w:drawing>
+                          <wp:inline distT="0" distB="0" distL="0" distR="0" wp14:anchorId="3643B62A" wp14:editId="5EB0492A">
+                            <wp:extent cx="593443" cy="821690"/>
+                            <wp:effectExtent l="0" t="0" r="3810" b="3810"/>
+                            <wp:docPr id="1820593160" name="Picture 1" descr="A qr code with purple text&#10;&#10;AI-generated content may be incorrect."/>
+                            <wp:cNvGraphicFramePr>
+                              <a:graphicFrameLocks xmlns:a="http://schemas.openxmlformats.org/drawingml/2006/main" noChangeAspect="1"/>
+                            </wp:cNvGraphicFramePr>
+                            <a:graphic xmlns:a="http://schemas.openxmlformats.org/drawingml/2006/main">
+                              <a:graphicData uri="http://schemas.openxmlformats.org/drawingml/2006/picture">
+                                <pic:pic xmlns:pic="http://schemas.openxmlformats.org/drawingml/2006/picture">
+                                  <pic:nvPicPr>
+                                    <pic:cNvPr id="842242424" name="Picture 1" descr="A qr code with purple text&#10;&#10;AI-generated content may be incorrect."/>
+                                    <pic:cNvPicPr/>
+                                  </pic:nvPicPr>
+                                  <pic:blipFill>
+                                    <a:blip r:embed="rId5" cstate="print">
+                                      <a:extLst>
+                                        <a:ext uri="{28A0092B-C50C-407E-A947-70E740481C1C}">
+                                          <a14:useLocalDpi xmlns:a14="http://schemas.microsoft.com/office/drawing/2010/main" val="0"/>
+                                        </a:ext>
+                                      </a:extLst>
+                                    </a:blip>
+                                    <a:stretch>
+                                      <a:fillRect/>
+                                    </a:stretch>
+                                  </pic:blipFill>
+                                  <pic:spPr>
+                                    <a:xfrm>
+                                      <a:off x="0" y="0"/>
+                                      <a:ext cx="608225" cy="842157"/>
+                                    </a:xfrm>
+                                    <a:prstGeom prst="rect">
+                                      <a:avLst/>
+                                    </a:prstGeom>
+                                  </pic:spPr>
+                                </pic:pic>
+                              </a:graphicData>
+                            </a:graphic>
+                          </wp:inline>
+                        </w:drawing>
+                      </w:r>
+                    </w:p>
+                  </w:txbxContent>
+                </v:textbox>
+                <w10:wrap type="square"/>
+              </v:shape>
+            </w:pict>
+          </mc:Fallback>
+        </mc:AlternateContent>
+      </w:r>
+    </w:p>
+    <w:p>
+      <w:pPr>
+        <w:spacing w:before="219" w:line="271" w:lineRule="auto"/>
+        <w:ind w:left="160"/>
+        <w:rPr>
+          <w:noProof/>
+        </w:rPr>
+      </w:pPr>
+    </w:p>
+    <w:p>
+      <w:pPr>
+        <w:spacing w:before="219" w:line="271" w:lineRule="auto"/>
+        <w:ind w:left="160"/>
+        <w:rPr>
+          <w:b/>
+          <w:sz w:val="23"/>
+        </w:rPr>
+      </w:pPr>
+    </w:p>
+    <w:p>
+      <w:pPr>
+        <w:spacing w:before="219" w:line="271" w:lineRule="auto"/>
+        <w:ind w:left="160"/>
+        <w:rPr>
+          <w:b/>
+          <w:sz w:val="23"/>
+        </w:rPr>
+      </w:pPr>
     </w:p>
     <w:p>
       <w:pPr>
@@ -1015,67 +1319,6 @@
         <w:spacing w:before="0" w:line="271" w:lineRule="auto"/>
         <w:ind w:right="7772"/>
       </w:pPr>
-    </w:p>
-    <w:p>
-      <w:pPr>
-        <w:pStyle w:val="BodyText"/>
-        <w:spacing w:before="0" w:line="271" w:lineRule="auto"/>
-        <w:ind w:right="7772"/>
-      </w:pPr>
-      <w:r>
-        <w:t>Golden</w:t>
-      </w:r>
-      <w:r>
-        <w:rPr>
-          <w:spacing w:val="-10"/>
-        </w:rPr>
-        <w:t xml:space="preserve"> </w:t>
-      </w:r>
-      <w:r>
-        <w:t>High</w:t>
-      </w:r>
-      <w:r>
-        <w:rPr>
-          <w:spacing w:val="-10"/>
-        </w:rPr>
-        <w:t xml:space="preserve"> </w:t>
-      </w:r>
-      <w:r>
-        <w:t>Class</w:t>
-      </w:r>
-      <w:r>
-        <w:rPr>
-          <w:spacing w:val="-10"/>
-        </w:rPr>
-        <w:t xml:space="preserve"> </w:t>
-      </w:r>
-      <w:r>
-        <w:t>of</w:t>
-      </w:r>
-      <w:r>
-        <w:rPr>
-          <w:spacing w:val="-10"/>
-        </w:rPr>
-        <w:t xml:space="preserve"> </w:t>
-      </w:r>
-      <w:r>
-        <w:t>‘76 269 Gardenia Ct</w:t>
-      </w:r>
-    </w:p>
-    <w:p>
-      <w:pPr>
-        <w:pStyle w:val="BodyText"/>
-        <w:spacing w:before="3"/>
-      </w:pPr>
-      <w:r>
-        <w:t xml:space="preserve">Golden, CO </w:t>
-      </w:r>
-      <w:r>
-        <w:rPr>
-          <w:spacing w:val="-2"/>
-        </w:rPr>
-        <w:t>80402</w:t>
-      </w:r>
     </w:p>
     <w:p>
       <w:pPr>
@@ -1494,12 +1737,6 @@
         </w:r>
       </w:hyperlink>
       <w:r>
-        <w:t xml:space="preserve"> </w:t>
-      </w:r>
-      <w:r>
-        <w:rPr>
-          <w:spacing w:val="-4"/>
-        </w:rPr>
         <w:t xml:space="preserve"> </w:t>
       </w:r>
       <w:r>

</xml_diff>

<commit_message>
1) edit invitation (docx and pdf) 2) added pictures 3) added RSVP 4) added paid status to RSVP table
</commit_message>
<xml_diff>
--- a/documents/invite50.docx
+++ b/documents/invite50.docx
@@ -736,230 +736,220 @@
         <w:ind w:left="160"/>
         <w:rPr>
           <w:b/>
-          <w:sz w:val="23"/>
-        </w:rPr>
-      </w:pPr>
-      <w:r>
-        <w:rPr>
-          <w:sz w:val="23"/>
-        </w:rPr>
-        <w:t>You can use the QR code below for easy payment via Zelle, or you may send payment by mail to the address</w:t>
-      </w:r>
-      <w:r>
-        <w:rPr>
-          <w:spacing w:val="-3"/>
-          <w:sz w:val="23"/>
-        </w:rPr>
-        <w:t xml:space="preserve"> </w:t>
-      </w:r>
-      <w:r>
-        <w:rPr>
-          <w:sz w:val="23"/>
-        </w:rPr>
-        <w:t>provided.</w:t>
-      </w:r>
-      <w:r>
-        <w:rPr>
-          <w:spacing w:val="-3"/>
-          <w:sz w:val="23"/>
-        </w:rPr>
-        <w:t xml:space="preserve"> </w:t>
-      </w:r>
-      <w:r>
-        <w:rPr>
-          <w:sz w:val="23"/>
-        </w:rPr>
-        <w:t>Make</w:t>
-      </w:r>
-      <w:r>
-        <w:rPr>
-          <w:spacing w:val="-3"/>
-          <w:sz w:val="23"/>
-        </w:rPr>
-        <w:t xml:space="preserve"> </w:t>
-      </w:r>
-      <w:r>
-        <w:rPr>
-          <w:sz w:val="23"/>
-        </w:rPr>
-        <w:t>checks</w:t>
-      </w:r>
-      <w:r>
-        <w:rPr>
-          <w:spacing w:val="-3"/>
-          <w:sz w:val="23"/>
-        </w:rPr>
-        <w:t xml:space="preserve"> </w:t>
-      </w:r>
-      <w:r>
-        <w:rPr>
-          <w:sz w:val="23"/>
-        </w:rPr>
-        <w:t>payable</w:t>
-      </w:r>
-      <w:r>
-        <w:rPr>
-          <w:spacing w:val="-3"/>
-          <w:sz w:val="23"/>
-        </w:rPr>
-        <w:t xml:space="preserve"> </w:t>
-      </w:r>
-      <w:r>
-        <w:rPr>
-          <w:sz w:val="23"/>
-        </w:rPr>
-        <w:t>to</w:t>
-      </w:r>
-      <w:r>
-        <w:rPr>
-          <w:spacing w:val="-3"/>
-          <w:sz w:val="23"/>
-        </w:rPr>
-        <w:t xml:space="preserve"> </w:t>
-      </w:r>
-      <w:r>
-        <w:rPr>
-          <w:sz w:val="23"/>
-        </w:rPr>
-        <w:t>Golden</w:t>
-      </w:r>
-      <w:r>
-        <w:rPr>
-          <w:spacing w:val="-3"/>
-          <w:sz w:val="23"/>
-        </w:rPr>
-        <w:t xml:space="preserve"> </w:t>
-      </w:r>
-      <w:r>
-        <w:rPr>
-          <w:sz w:val="23"/>
-        </w:rPr>
-        <w:t>High</w:t>
-      </w:r>
-      <w:r>
-        <w:rPr>
-          <w:spacing w:val="-3"/>
-          <w:sz w:val="23"/>
-        </w:rPr>
-        <w:t xml:space="preserve"> </w:t>
-      </w:r>
-      <w:r>
-        <w:rPr>
-          <w:sz w:val="23"/>
-        </w:rPr>
-        <w:t>Class</w:t>
-      </w:r>
-      <w:r>
-        <w:rPr>
-          <w:spacing w:val="-3"/>
-          <w:sz w:val="23"/>
-        </w:rPr>
-        <w:t xml:space="preserve"> </w:t>
-      </w:r>
-      <w:r>
-        <w:rPr>
-          <w:sz w:val="23"/>
-        </w:rPr>
-        <w:t>of</w:t>
-      </w:r>
-      <w:r>
-        <w:rPr>
-          <w:spacing w:val="-3"/>
-          <w:sz w:val="23"/>
-        </w:rPr>
-        <w:t xml:space="preserve"> </w:t>
-      </w:r>
-      <w:r>
-        <w:rPr>
-          <w:sz w:val="23"/>
-        </w:rPr>
-        <w:t>‘76.</w:t>
-      </w:r>
-      <w:r>
-        <w:rPr>
-          <w:spacing w:val="-3"/>
-          <w:sz w:val="23"/>
-        </w:rPr>
-        <w:t xml:space="preserve"> </w:t>
-      </w:r>
-      <w:r>
-        <w:rPr>
-          <w:b/>
-          <w:sz w:val="23"/>
-        </w:rPr>
-        <w:t>All</w:t>
-      </w:r>
-      <w:r>
-        <w:rPr>
-          <w:b/>
-          <w:spacing w:val="-3"/>
-          <w:sz w:val="23"/>
-        </w:rPr>
-        <w:t xml:space="preserve"> </w:t>
-      </w:r>
-      <w:r>
-        <w:rPr>
-          <w:b/>
-          <w:sz w:val="23"/>
-        </w:rPr>
-        <w:t>payments</w:t>
-      </w:r>
-      <w:r>
-        <w:rPr>
-          <w:b/>
-          <w:spacing w:val="-3"/>
-          <w:sz w:val="23"/>
-        </w:rPr>
-        <w:t xml:space="preserve"> </w:t>
-      </w:r>
-      <w:r>
-        <w:rPr>
-          <w:b/>
-          <w:sz w:val="23"/>
-        </w:rPr>
-        <w:t>must</w:t>
-      </w:r>
-      <w:r>
-        <w:rPr>
-          <w:b/>
-          <w:spacing w:val="-3"/>
-          <w:sz w:val="23"/>
-        </w:rPr>
-        <w:t xml:space="preserve"> </w:t>
-      </w:r>
-      <w:r>
-        <w:rPr>
-          <w:b/>
-          <w:sz w:val="23"/>
-        </w:rPr>
-        <w:t>be</w:t>
-      </w:r>
-      <w:r>
-        <w:rPr>
-          <w:b/>
-          <w:spacing w:val="-3"/>
-          <w:sz w:val="23"/>
-        </w:rPr>
-        <w:t xml:space="preserve"> </w:t>
-      </w:r>
-      <w:r>
-        <w:rPr>
-          <w:b/>
-          <w:sz w:val="23"/>
-        </w:rPr>
-        <w:t>received by August 14, 2026.</w:t>
-      </w:r>
-    </w:p>
-    <w:p>
-      <w:pPr>
-        <w:spacing w:before="219" w:line="271" w:lineRule="auto"/>
-        <w:ind w:left="160"/>
-        <w:rPr>
-          <w:b/>
           <w:sz w:val="16"/>
           <w:szCs w:val="16"/>
         </w:rPr>
       </w:pPr>
+      <w:r>
+        <w:rPr>
+          <w:sz w:val="23"/>
+        </w:rPr>
+        <w:t>You can use the QR code below for easy payment via Zelle, or you may send payment by mail to the address</w:t>
+      </w:r>
+      <w:r>
+        <w:rPr>
+          <w:spacing w:val="-3"/>
+          <w:sz w:val="23"/>
+        </w:rPr>
+        <w:t xml:space="preserve"> </w:t>
+      </w:r>
+      <w:r>
+        <w:rPr>
+          <w:sz w:val="23"/>
+        </w:rPr>
+        <w:t>provided.</w:t>
+      </w:r>
+      <w:r>
+        <w:rPr>
+          <w:spacing w:val="-3"/>
+          <w:sz w:val="23"/>
+        </w:rPr>
+        <w:t xml:space="preserve"> </w:t>
+      </w:r>
+      <w:r>
+        <w:rPr>
+          <w:sz w:val="23"/>
+        </w:rPr>
+        <w:t>Make</w:t>
+      </w:r>
+      <w:r>
+        <w:rPr>
+          <w:spacing w:val="-3"/>
+          <w:sz w:val="23"/>
+        </w:rPr>
+        <w:t xml:space="preserve"> </w:t>
+      </w:r>
+      <w:r>
+        <w:rPr>
+          <w:sz w:val="23"/>
+        </w:rPr>
+        <w:t>checks</w:t>
+      </w:r>
+      <w:r>
+        <w:rPr>
+          <w:spacing w:val="-3"/>
+          <w:sz w:val="23"/>
+        </w:rPr>
+        <w:t xml:space="preserve"> </w:t>
+      </w:r>
+      <w:r>
+        <w:rPr>
+          <w:sz w:val="23"/>
+        </w:rPr>
+        <w:t>payable</w:t>
+      </w:r>
+      <w:r>
+        <w:rPr>
+          <w:spacing w:val="-3"/>
+          <w:sz w:val="23"/>
+        </w:rPr>
+        <w:t xml:space="preserve"> </w:t>
+      </w:r>
+      <w:r>
+        <w:rPr>
+          <w:sz w:val="23"/>
+        </w:rPr>
+        <w:t>to</w:t>
+      </w:r>
+      <w:r>
+        <w:rPr>
+          <w:spacing w:val="-3"/>
+          <w:sz w:val="23"/>
+        </w:rPr>
+        <w:t xml:space="preserve"> </w:t>
+      </w:r>
+      <w:r>
+        <w:rPr>
+          <w:sz w:val="23"/>
+        </w:rPr>
+        <w:t>Golden</w:t>
+      </w:r>
+      <w:r>
+        <w:rPr>
+          <w:spacing w:val="-3"/>
+          <w:sz w:val="23"/>
+        </w:rPr>
+        <w:t xml:space="preserve"> </w:t>
+      </w:r>
+      <w:r>
+        <w:rPr>
+          <w:sz w:val="23"/>
+        </w:rPr>
+        <w:t>High</w:t>
+      </w:r>
+      <w:r>
+        <w:rPr>
+          <w:spacing w:val="-3"/>
+          <w:sz w:val="23"/>
+        </w:rPr>
+        <w:t xml:space="preserve"> </w:t>
+      </w:r>
+      <w:r>
+        <w:rPr>
+          <w:sz w:val="23"/>
+        </w:rPr>
+        <w:t>Class</w:t>
+      </w:r>
+      <w:r>
+        <w:rPr>
+          <w:spacing w:val="-3"/>
+          <w:sz w:val="23"/>
+        </w:rPr>
+        <w:t xml:space="preserve"> </w:t>
+      </w:r>
+      <w:r>
+        <w:rPr>
+          <w:sz w:val="23"/>
+        </w:rPr>
+        <w:t>of</w:t>
+      </w:r>
+      <w:r>
+        <w:rPr>
+          <w:spacing w:val="-3"/>
+          <w:sz w:val="23"/>
+        </w:rPr>
+        <w:t xml:space="preserve"> </w:t>
+      </w:r>
+      <w:r>
+        <w:rPr>
+          <w:sz w:val="23"/>
+        </w:rPr>
+        <w:t>‘76.</w:t>
+      </w:r>
+      <w:r>
+        <w:rPr>
+          <w:spacing w:val="-3"/>
+          <w:sz w:val="23"/>
+        </w:rPr>
+        <w:t xml:space="preserve"> </w:t>
+      </w:r>
+      <w:r>
+        <w:rPr>
+          <w:b/>
+          <w:sz w:val="23"/>
+        </w:rPr>
+        <w:t>All</w:t>
+      </w:r>
+      <w:r>
+        <w:rPr>
+          <w:b/>
+          <w:spacing w:val="-3"/>
+          <w:sz w:val="23"/>
+        </w:rPr>
+        <w:t xml:space="preserve"> </w:t>
+      </w:r>
+      <w:r>
+        <w:rPr>
+          <w:b/>
+          <w:sz w:val="23"/>
+        </w:rPr>
+        <w:t>payments</w:t>
+      </w:r>
+      <w:r>
+        <w:rPr>
+          <w:b/>
+          <w:spacing w:val="-3"/>
+          <w:sz w:val="23"/>
+        </w:rPr>
+        <w:t xml:space="preserve"> </w:t>
+      </w:r>
+      <w:r>
+        <w:rPr>
+          <w:b/>
+          <w:sz w:val="23"/>
+        </w:rPr>
+        <w:t>must</w:t>
+      </w:r>
+      <w:r>
+        <w:rPr>
+          <w:b/>
+          <w:spacing w:val="-3"/>
+          <w:sz w:val="23"/>
+        </w:rPr>
+        <w:t xml:space="preserve"> </w:t>
+      </w:r>
+      <w:r>
+        <w:rPr>
+          <w:b/>
+          <w:sz w:val="23"/>
+        </w:rPr>
+        <w:t>be</w:t>
+      </w:r>
+      <w:r>
+        <w:rPr>
+          <w:b/>
+          <w:spacing w:val="-3"/>
+          <w:sz w:val="23"/>
+        </w:rPr>
+        <w:t xml:space="preserve"> </w:t>
+      </w:r>
+      <w:r>
+        <w:rPr>
+          <w:b/>
+          <w:sz w:val="23"/>
+        </w:rPr>
+        <w:t>received by August 14, 2026.</w:t>
+      </w:r>
     </w:p>
     <w:p>
       <w:pPr>

</xml_diff>

<commit_message>
1) removed paid status in RSVP table 2) updated invitation
</commit_message>
<xml_diff>
--- a/documents/invite50.docx
+++ b/documents/invite50.docx
@@ -19,9 +19,9 @@
         <mc:AlternateContent>
           <mc:Choice Requires="wps">
             <w:drawing>
-              <wp:inline distT="0" distB="0" distL="0" distR="0" wp14:anchorId="24ABEB3F" wp14:editId="726CA66D">
-                <wp:extent cx="6604000" cy="520700"/>
-                <wp:effectExtent l="19050" t="9525" r="6350" b="12700"/>
+              <wp:inline distT="0" distB="0" distL="0" distR="0" wp14:anchorId="24ABEB3F" wp14:editId="098A341D">
+                <wp:extent cx="6604000" cy="962025"/>
+                <wp:effectExtent l="0" t="0" r="25400" b="28575"/>
                 <wp:docPr id="1" name="Textbox 1"/>
                 <wp:cNvGraphicFramePr>
                   <a:graphicFrameLocks xmlns:a="http://schemas.openxmlformats.org/drawingml/2006/main"/>
@@ -35,7 +35,7 @@
                       <wps:spPr>
                         <a:xfrm>
                           <a:off x="0" y="0"/>
-                          <a:ext cx="6604000" cy="520700"/>
+                          <a:ext cx="6604000" cy="962025"/>
                         </a:xfrm>
                         <a:prstGeom prst="rect">
                           <a:avLst/>
@@ -58,7 +58,8 @@
                               <w:jc w:val="center"/>
                               <w:rPr>
                                 <w:b/>
-                                <w:color w:val="000000"/>
+                                <w:color w:val="FFFFFF"/>
+                                <w:spacing w:val="-4"/>
                                 <w:sz w:val="42"/>
                               </w:rPr>
                             </w:pPr>
@@ -80,6 +81,25 @@
                               <w:t>1976</w:t>
                             </w:r>
                           </w:p>
+                          <w:p>
+                            <w:pPr>
+                              <w:spacing w:before="186"/>
+                              <w:jc w:val="center"/>
+                              <w:rPr>
+                                <w:b/>
+                                <w:color w:val="FFFFFF" w:themeColor="background1"/>
+                                <w:sz w:val="42"/>
+                              </w:rPr>
+                            </w:pPr>
+                            <w:r>
+                              <w:rPr>
+                                <w:b/>
+                                <w:color w:val="FFFFFF" w:themeColor="background1"/>
+                                <w:sz w:val="42"/>
+                              </w:rPr>
+                              <w:t>50-year reunion</w:t>
+                            </w:r>
+                          </w:p>
                         </w:txbxContent>
                       </wps:txbx>
                       <wps:bodyPr wrap="square" lIns="0" tIns="0" rIns="0" bIns="0" rtlCol="0">
@@ -97,7 +117,7 @@
                 <v:stroke joinstyle="miter"/>
                 <v:path gradientshapeok="t" o:connecttype="rect"/>
               </v:shapetype>
-              <v:shape id="Textbox 1" o:spid="_x0000_s1026" type="#_x0000_t202" style="width:520pt;height:41pt;visibility:visible;mso-wrap-style:square;mso-left-percent:-10001;mso-top-percent:-10001;mso-position-horizontal:absolute;mso-position-horizontal-relative:char;mso-position-vertical:absolute;mso-position-vertical-relative:line;mso-left-percent:-10001;mso-top-percent:-10001;v-text-anchor:top" o:gfxdata="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" fillcolor="#791d2b" strokecolor="#d4af36" strokeweight="2pt">
+              <v:shape id="Textbox 1" o:spid="_x0000_s1026" type="#_x0000_t202" style="width:520pt;height:75.75pt;visibility:visible;mso-wrap-style:square;mso-left-percent:-10001;mso-top-percent:-10001;mso-position-horizontal:absolute;mso-position-horizontal-relative:char;mso-position-vertical:absolute;mso-position-vertical-relative:line;mso-left-percent:-10001;mso-top-percent:-10001;v-text-anchor:top" o:gfxdata="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" fillcolor="#791d2b" strokecolor="#d4af36" strokeweight="2pt">
                 <v:path arrowok="t"/>
                 <v:textbox inset="0,0,0,0">
                   <w:txbxContent>
@@ -107,7 +127,8 @@
                         <w:jc w:val="center"/>
                         <w:rPr>
                           <w:b/>
-                          <w:color w:val="000000"/>
+                          <w:color w:val="FFFFFF"/>
+                          <w:spacing w:val="-4"/>
                           <w:sz w:val="42"/>
                         </w:rPr>
                       </w:pPr>
@@ -129,6 +150,25 @@
                         <w:t>1976</w:t>
                       </w:r>
                     </w:p>
+                    <w:p>
+                      <w:pPr>
+                        <w:spacing w:before="186"/>
+                        <w:jc w:val="center"/>
+                        <w:rPr>
+                          <w:b/>
+                          <w:color w:val="FFFFFF" w:themeColor="background1"/>
+                          <w:sz w:val="42"/>
+                        </w:rPr>
+                      </w:pPr>
+                      <w:r>
+                        <w:rPr>
+                          <w:b/>
+                          <w:color w:val="FFFFFF" w:themeColor="background1"/>
+                          <w:sz w:val="42"/>
+                        </w:rPr>
+                        <w:t>50-year reunion</w:t>
+                      </w:r>
+                    </w:p>
                   </w:txbxContent>
                 </v:textbox>
                 <w10:anchorlock/>
@@ -968,13 +1008,224 @@
         <mc:AlternateContent>
           <mc:Choice Requires="wps">
             <w:drawing>
-              <wp:anchor distT="45720" distB="45720" distL="114300" distR="114300" simplePos="0" relativeHeight="251658752" behindDoc="0" locked="0" layoutInCell="1" allowOverlap="1" wp14:anchorId="7C855C13" wp14:editId="5AFFC6DF">
+              <wp:anchor distT="45720" distB="45720" distL="114300" distR="114300" simplePos="0" relativeHeight="251667456" behindDoc="0" locked="0" layoutInCell="1" allowOverlap="1" wp14:anchorId="005DB03D" wp14:editId="436265E3">
                 <wp:simplePos x="0" y="0"/>
                 <wp:positionH relativeFrom="column">
-                  <wp:posOffset>3609975</wp:posOffset>
+                  <wp:posOffset>4408805</wp:posOffset>
                 </wp:positionH>
                 <wp:positionV relativeFrom="paragraph">
-                  <wp:posOffset>269240</wp:posOffset>
+                  <wp:posOffset>263525</wp:posOffset>
+                </wp:positionV>
+                <wp:extent cx="1076325" cy="1059815"/>
+                <wp:effectExtent l="0" t="0" r="28575" b="26035"/>
+                <wp:wrapSquare wrapText="bothSides"/>
+                <wp:docPr id="492374582" name="Text Box 2"/>
+                <wp:cNvGraphicFramePr>
+                  <a:graphicFrameLocks xmlns:a="http://schemas.openxmlformats.org/drawingml/2006/main"/>
+                </wp:cNvGraphicFramePr>
+                <a:graphic xmlns:a="http://schemas.openxmlformats.org/drawingml/2006/main">
+                  <a:graphicData uri="http://schemas.microsoft.com/office/word/2010/wordprocessingShape">
+                    <wps:wsp>
+                      <wps:cNvSpPr txBox="1">
+                        <a:spLocks noChangeArrowheads="1"/>
+                      </wps:cNvSpPr>
+                      <wps:spPr bwMode="auto">
+                        <a:xfrm>
+                          <a:off x="0" y="0"/>
+                          <a:ext cx="1076325" cy="1059815"/>
+                        </a:xfrm>
+                        <a:prstGeom prst="rect">
+                          <a:avLst/>
+                        </a:prstGeom>
+                        <a:solidFill>
+                          <a:srgbClr val="FFFFFF"/>
+                        </a:solidFill>
+                        <a:ln w="9525">
+                          <a:solidFill>
+                            <a:srgbClr val="000000"/>
+                          </a:solidFill>
+                          <a:miter lim="800000"/>
+                          <a:headEnd/>
+                          <a:tailEnd/>
+                        </a:ln>
+                      </wps:spPr>
+                      <wps:txbx>
+                        <w:txbxContent>
+                          <w:p>
+                            <w:pPr>
+                              <w:rPr>
+                                <w:sz w:val="16"/>
+                                <w:szCs w:val="16"/>
+                              </w:rPr>
+                            </w:pPr>
+                          </w:p>
+                          <w:p>
+                            <w:pPr>
+                              <w:jc w:val="center"/>
+                            </w:pPr>
+                            <w:r>
+                              <w:rPr>
+                                <w:noProof/>
+                              </w:rPr>
+                              <w:drawing>
+                                <wp:inline distT="0" distB="0" distL="0" distR="0" wp14:anchorId="5C14C042" wp14:editId="3C8C98FB">
+                                  <wp:extent cx="589280" cy="816411"/>
+                                  <wp:effectExtent l="0" t="0" r="1270" b="3175"/>
+                                  <wp:docPr id="1820593160" name="Picture 1" descr="A qr code with purple text&#10;&#10;AI-generated content may be incorrect."/>
+                                  <wp:cNvGraphicFramePr>
+                                    <a:graphicFrameLocks xmlns:a="http://schemas.openxmlformats.org/drawingml/2006/main" noChangeAspect="1"/>
+                                  </wp:cNvGraphicFramePr>
+                                  <a:graphic xmlns:a="http://schemas.openxmlformats.org/drawingml/2006/main">
+                                    <a:graphicData uri="http://schemas.openxmlformats.org/drawingml/2006/picture">
+                                      <pic:pic xmlns:pic="http://schemas.openxmlformats.org/drawingml/2006/picture">
+                                        <pic:nvPicPr>
+                                          <pic:cNvPr id="842242424" name="Picture 1" descr="A qr code with purple text&#10;&#10;AI-generated content may be incorrect."/>
+                                          <pic:cNvPicPr/>
+                                        </pic:nvPicPr>
+                                        <pic:blipFill>
+                                          <a:blip r:embed="rId5" cstate="print">
+                                            <a:extLst>
+                                              <a:ext uri="{28A0092B-C50C-407E-A947-70E740481C1C}">
+                                                <a14:useLocalDpi xmlns:a14="http://schemas.microsoft.com/office/drawing/2010/main" val="0"/>
+                                              </a:ext>
+                                            </a:extLst>
+                                          </a:blip>
+                                          <a:stretch>
+                                            <a:fillRect/>
+                                          </a:stretch>
+                                        </pic:blipFill>
+                                        <pic:spPr>
+                                          <a:xfrm>
+                                            <a:off x="0" y="0"/>
+                                            <a:ext cx="589280" cy="816411"/>
+                                          </a:xfrm>
+                                          <a:prstGeom prst="rect">
+                                            <a:avLst/>
+                                          </a:prstGeom>
+                                        </pic:spPr>
+                                      </pic:pic>
+                                    </a:graphicData>
+                                  </a:graphic>
+                                </wp:inline>
+                              </w:drawing>
+                            </w:r>
+                          </w:p>
+                          <w:p/>
+                        </w:txbxContent>
+                      </wps:txbx>
+                      <wps:bodyPr rot="0" vert="horz" wrap="square" lIns="91440" tIns="45720" rIns="91440" bIns="45720" anchor="t" anchorCtr="0">
+                        <a:noAutofit/>
+                      </wps:bodyPr>
+                    </wps:wsp>
+                  </a:graphicData>
+                </a:graphic>
+                <wp14:sizeRelH relativeFrom="margin">
+                  <wp14:pctWidth>0</wp14:pctWidth>
+                </wp14:sizeRelH>
+                <wp14:sizeRelV relativeFrom="margin">
+                  <wp14:pctHeight>0</wp14:pctHeight>
+                </wp14:sizeRelV>
+              </wp:anchor>
+            </w:drawing>
+          </mc:Choice>
+          <mc:Fallback>
+            <w:pict>
+              <v:shape w14:anchorId="005DB03D" id="Text Box 2" o:spid="_x0000_s1027" type="#_x0000_t202" style="position:absolute;left:0;text-align:left;margin-left:347.15pt;margin-top:20.75pt;width:84.75pt;height:83.45pt;z-index:251667456;visibility:visible;mso-wrap-style:square;mso-width-percent:0;mso-height-percent:0;mso-wrap-distance-left:9pt;mso-wrap-distance-top:3.6pt;mso-wrap-distance-right:9pt;mso-wrap-distance-bottom:3.6pt;mso-position-horizontal:absolute;mso-position-horizontal-relative:text;mso-position-vertical:absolute;mso-position-vertical-relative:text;mso-width-percent:0;mso-height-percent:0;mso-width-relative:margin;mso-height-relative:margin;v-text-anchor:top" o:gfxdata="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">
+                <v:textbox>
+                  <w:txbxContent>
+                    <w:p>
+                      <w:pPr>
+                        <w:rPr>
+                          <w:sz w:val="16"/>
+                          <w:szCs w:val="16"/>
+                        </w:rPr>
+                      </w:pPr>
+                    </w:p>
+                    <w:p>
+                      <w:pPr>
+                        <w:jc w:val="center"/>
+                      </w:pPr>
+                      <w:r>
+                        <w:rPr>
+                          <w:noProof/>
+                        </w:rPr>
+                        <w:drawing>
+                          <wp:inline distT="0" distB="0" distL="0" distR="0" wp14:anchorId="5C14C042" wp14:editId="3C8C98FB">
+                            <wp:extent cx="589280" cy="816411"/>
+                            <wp:effectExtent l="0" t="0" r="1270" b="3175"/>
+                            <wp:docPr id="1820593160" name="Picture 1" descr="A qr code with purple text&#10;&#10;AI-generated content may be incorrect."/>
+                            <wp:cNvGraphicFramePr>
+                              <a:graphicFrameLocks xmlns:a="http://schemas.openxmlformats.org/drawingml/2006/main" noChangeAspect="1"/>
+                            </wp:cNvGraphicFramePr>
+                            <a:graphic xmlns:a="http://schemas.openxmlformats.org/drawingml/2006/main">
+                              <a:graphicData uri="http://schemas.openxmlformats.org/drawingml/2006/picture">
+                                <pic:pic xmlns:pic="http://schemas.openxmlformats.org/drawingml/2006/picture">
+                                  <pic:nvPicPr>
+                                    <pic:cNvPr id="842242424" name="Picture 1" descr="A qr code with purple text&#10;&#10;AI-generated content may be incorrect."/>
+                                    <pic:cNvPicPr/>
+                                  </pic:nvPicPr>
+                                  <pic:blipFill>
+                                    <a:blip r:embed="rId5" cstate="print">
+                                      <a:extLst>
+                                        <a:ext uri="{28A0092B-C50C-407E-A947-70E740481C1C}">
+                                          <a14:useLocalDpi xmlns:a14="http://schemas.microsoft.com/office/drawing/2010/main" val="0"/>
+                                        </a:ext>
+                                      </a:extLst>
+                                    </a:blip>
+                                    <a:stretch>
+                                      <a:fillRect/>
+                                    </a:stretch>
+                                  </pic:blipFill>
+                                  <pic:spPr>
+                                    <a:xfrm>
+                                      <a:off x="0" y="0"/>
+                                      <a:ext cx="589280" cy="816411"/>
+                                    </a:xfrm>
+                                    <a:prstGeom prst="rect">
+                                      <a:avLst/>
+                                    </a:prstGeom>
+                                  </pic:spPr>
+                                </pic:pic>
+                              </a:graphicData>
+                            </a:graphic>
+                          </wp:inline>
+                        </w:drawing>
+                      </w:r>
+                    </w:p>
+                    <w:p/>
+                  </w:txbxContent>
+                </v:textbox>
+                <w10:wrap type="square"/>
+              </v:shape>
+            </w:pict>
+          </mc:Fallback>
+        </mc:AlternateContent>
+      </w:r>
+    </w:p>
+    <w:p>
+      <w:pPr>
+        <w:spacing w:before="219" w:line="271" w:lineRule="auto"/>
+        <w:ind w:left="160"/>
+        <w:rPr>
+          <w:noProof/>
+        </w:rPr>
+      </w:pPr>
+      <w:r>
+        <w:rPr>
+          <w:b/>
+          <w:noProof/>
+          <w:sz w:val="23"/>
+        </w:rPr>
+        <mc:AlternateContent>
+          <mc:Choice Requires="wps">
+            <w:drawing>
+              <wp:anchor distT="45720" distB="45720" distL="114300" distR="114300" simplePos="0" relativeHeight="251656192" behindDoc="0" locked="0" layoutInCell="1" allowOverlap="1" wp14:anchorId="7C855C13" wp14:editId="6C739D1D">
+                <wp:simplePos x="0" y="0"/>
+                <wp:positionH relativeFrom="column">
+                  <wp:posOffset>1314450</wp:posOffset>
+                </wp:positionH>
+                <wp:positionV relativeFrom="paragraph">
+                  <wp:posOffset>44450</wp:posOffset>
                 </wp:positionV>
                 <wp:extent cx="1771650" cy="964565"/>
                 <wp:effectExtent l="0" t="0" r="19050" b="26035"/>
@@ -1051,7 +1302,7 @@
           </mc:Choice>
           <mc:Fallback>
             <w:pict>
-              <v:shape w14:anchorId="7C855C13" id="Text Box 2" o:spid="_x0000_s1027" type="#_x0000_t202" style="position:absolute;left:0;text-align:left;margin-left:284.25pt;margin-top:21.2pt;width:139.5pt;height:75.95pt;z-index:251658752;visibility:visible;mso-wrap-style:square;mso-width-percent:0;mso-height-percent:0;mso-wrap-distance-left:9pt;mso-wrap-distance-top:3.6pt;mso-wrap-distance-right:9pt;mso-wrap-distance-bottom:3.6pt;mso-position-horizontal:absolute;mso-position-horizontal-relative:text;mso-position-vertical:absolute;mso-position-vertical-relative:text;mso-width-percent:0;mso-height-percent:0;mso-width-relative:margin;mso-height-relative:margin;v-text-anchor:top" o:gfxdata="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">
+              <v:shape w14:anchorId="7C855C13" id="_x0000_s1028" type="#_x0000_t202" style="position:absolute;left:0;text-align:left;margin-left:103.5pt;margin-top:3.5pt;width:139.5pt;height:75.95pt;z-index:251656192;visibility:visible;mso-wrap-style:square;mso-width-percent:0;mso-height-percent:0;mso-wrap-distance-left:9pt;mso-wrap-distance-top:3.6pt;mso-wrap-distance-right:9pt;mso-wrap-distance-bottom:3.6pt;mso-position-horizontal:absolute;mso-position-horizontal-relative:text;mso-position-vertical:absolute;mso-position-vertical-relative:text;mso-width-percent:0;mso-height-percent:0;mso-width-relative:margin;mso-height-relative:margin;v-text-anchor:top" o:gfxdata="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">
                 <v:textbox>
                   <w:txbxContent>
                     <w:p>
@@ -1083,205 +1334,6 @@
           </mc:Fallback>
         </mc:AlternateContent>
       </w:r>
-      <w:r>
-        <w:rPr>
-          <w:b/>
-          <w:noProof/>
-          <w:sz w:val="23"/>
-        </w:rPr>
-        <mc:AlternateContent>
-          <mc:Choice Requires="wps">
-            <w:drawing>
-              <wp:anchor distT="45720" distB="45720" distL="114300" distR="114300" simplePos="0" relativeHeight="251672064" behindDoc="0" locked="0" layoutInCell="1" allowOverlap="1" wp14:anchorId="005DB03D" wp14:editId="34F7911A">
-                <wp:simplePos x="0" y="0"/>
-                <wp:positionH relativeFrom="column">
-                  <wp:posOffset>1057275</wp:posOffset>
-                </wp:positionH>
-                <wp:positionV relativeFrom="paragraph">
-                  <wp:posOffset>126365</wp:posOffset>
-                </wp:positionV>
-                <wp:extent cx="1362075" cy="1276350"/>
-                <wp:effectExtent l="0" t="0" r="28575" b="19050"/>
-                <wp:wrapSquare wrapText="bothSides"/>
-                <wp:docPr id="492374582" name="Text Box 2"/>
-                <wp:cNvGraphicFramePr>
-                  <a:graphicFrameLocks xmlns:a="http://schemas.openxmlformats.org/drawingml/2006/main"/>
-                </wp:cNvGraphicFramePr>
-                <a:graphic xmlns:a="http://schemas.openxmlformats.org/drawingml/2006/main">
-                  <a:graphicData uri="http://schemas.microsoft.com/office/word/2010/wordprocessingShape">
-                    <wps:wsp>
-                      <wps:cNvSpPr txBox="1">
-                        <a:spLocks noChangeArrowheads="1"/>
-                      </wps:cNvSpPr>
-                      <wps:spPr bwMode="auto">
-                        <a:xfrm>
-                          <a:off x="0" y="0"/>
-                          <a:ext cx="1362075" cy="1276350"/>
-                        </a:xfrm>
-                        <a:prstGeom prst="rect">
-                          <a:avLst/>
-                        </a:prstGeom>
-                        <a:solidFill>
-                          <a:srgbClr val="FFFFFF"/>
-                        </a:solidFill>
-                        <a:ln w="9525">
-                          <a:solidFill>
-                            <a:srgbClr val="000000"/>
-                          </a:solidFill>
-                          <a:miter lim="800000"/>
-                          <a:headEnd/>
-                          <a:tailEnd/>
-                        </a:ln>
-                      </wps:spPr>
-                      <wps:txbx>
-                        <w:txbxContent>
-                          <w:p>
-                            <w:r>
-                              <w:t>QR code for Zelle:</w:t>
-                            </w:r>
-                          </w:p>
-                          <w:p/>
-                          <w:p>
-                            <w:r>
-                              <w:rPr>
-                                <w:noProof/>
-                              </w:rPr>
-                              <w:drawing>
-                                <wp:inline distT="0" distB="0" distL="0" distR="0" wp14:anchorId="3643B62A" wp14:editId="5EB0492A">
-                                  <wp:extent cx="593443" cy="821690"/>
-                                  <wp:effectExtent l="0" t="0" r="3810" b="3810"/>
-                                  <wp:docPr id="1820593160" name="Picture 1" descr="A qr code with purple text&#10;&#10;AI-generated content may be incorrect."/>
-                                  <wp:cNvGraphicFramePr>
-                                    <a:graphicFrameLocks xmlns:a="http://schemas.openxmlformats.org/drawingml/2006/main" noChangeAspect="1"/>
-                                  </wp:cNvGraphicFramePr>
-                                  <a:graphic xmlns:a="http://schemas.openxmlformats.org/drawingml/2006/main">
-                                    <a:graphicData uri="http://schemas.openxmlformats.org/drawingml/2006/picture">
-                                      <pic:pic xmlns:pic="http://schemas.openxmlformats.org/drawingml/2006/picture">
-                                        <pic:nvPicPr>
-                                          <pic:cNvPr id="842242424" name="Picture 1" descr="A qr code with purple text&#10;&#10;AI-generated content may be incorrect."/>
-                                          <pic:cNvPicPr/>
-                                        </pic:nvPicPr>
-                                        <pic:blipFill>
-                                          <a:blip r:embed="rId5" cstate="print">
-                                            <a:extLst>
-                                              <a:ext uri="{28A0092B-C50C-407E-A947-70E740481C1C}">
-                                                <a14:useLocalDpi xmlns:a14="http://schemas.microsoft.com/office/drawing/2010/main" val="0"/>
-                                              </a:ext>
-                                            </a:extLst>
-                                          </a:blip>
-                                          <a:stretch>
-                                            <a:fillRect/>
-                                          </a:stretch>
-                                        </pic:blipFill>
-                                        <pic:spPr>
-                                          <a:xfrm>
-                                            <a:off x="0" y="0"/>
-                                            <a:ext cx="608225" cy="842157"/>
-                                          </a:xfrm>
-                                          <a:prstGeom prst="rect">
-                                            <a:avLst/>
-                                          </a:prstGeom>
-                                        </pic:spPr>
-                                      </pic:pic>
-                                    </a:graphicData>
-                                  </a:graphic>
-                                </wp:inline>
-                              </w:drawing>
-                            </w:r>
-                          </w:p>
-                        </w:txbxContent>
-                      </wps:txbx>
-                      <wps:bodyPr rot="0" vert="horz" wrap="square" lIns="91440" tIns="45720" rIns="91440" bIns="45720" anchor="t" anchorCtr="0">
-                        <a:noAutofit/>
-                      </wps:bodyPr>
-                    </wps:wsp>
-                  </a:graphicData>
-                </a:graphic>
-                <wp14:sizeRelH relativeFrom="margin">
-                  <wp14:pctWidth>0</wp14:pctWidth>
-                </wp14:sizeRelH>
-                <wp14:sizeRelV relativeFrom="margin">
-                  <wp14:pctHeight>0</wp14:pctHeight>
-                </wp14:sizeRelV>
-              </wp:anchor>
-            </w:drawing>
-          </mc:Choice>
-          <mc:Fallback>
-            <w:pict>
-              <v:shape w14:anchorId="005DB03D" id="_x0000_s1028" type="#_x0000_t202" style="position:absolute;left:0;text-align:left;margin-left:83.25pt;margin-top:9.95pt;width:107.25pt;height:100.5pt;z-index:251672064;visibility:visible;mso-wrap-style:square;mso-width-percent:0;mso-height-percent:0;mso-wrap-distance-left:9pt;mso-wrap-distance-top:3.6pt;mso-wrap-distance-right:9pt;mso-wrap-distance-bottom:3.6pt;mso-position-horizontal:absolute;mso-position-horizontal-relative:text;mso-position-vertical:absolute;mso-position-vertical-relative:text;mso-width-percent:0;mso-height-percent:0;mso-width-relative:margin;mso-height-relative:margin;v-text-anchor:top" o:gfxdata="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">
-                <v:textbox>
-                  <w:txbxContent>
-                    <w:p>
-                      <w:r>
-                        <w:t>QR code for Zelle:</w:t>
-                      </w:r>
-                    </w:p>
-                    <w:p/>
-                    <w:p>
-                      <w:r>
-                        <w:rPr>
-                          <w:noProof/>
-                        </w:rPr>
-                        <w:drawing>
-                          <wp:inline distT="0" distB="0" distL="0" distR="0" wp14:anchorId="3643B62A" wp14:editId="5EB0492A">
-                            <wp:extent cx="593443" cy="821690"/>
-                            <wp:effectExtent l="0" t="0" r="3810" b="3810"/>
-                            <wp:docPr id="1820593160" name="Picture 1" descr="A qr code with purple text&#10;&#10;AI-generated content may be incorrect."/>
-                            <wp:cNvGraphicFramePr>
-                              <a:graphicFrameLocks xmlns:a="http://schemas.openxmlformats.org/drawingml/2006/main" noChangeAspect="1"/>
-                            </wp:cNvGraphicFramePr>
-                            <a:graphic xmlns:a="http://schemas.openxmlformats.org/drawingml/2006/main">
-                              <a:graphicData uri="http://schemas.openxmlformats.org/drawingml/2006/picture">
-                                <pic:pic xmlns:pic="http://schemas.openxmlformats.org/drawingml/2006/picture">
-                                  <pic:nvPicPr>
-                                    <pic:cNvPr id="842242424" name="Picture 1" descr="A qr code with purple text&#10;&#10;AI-generated content may be incorrect."/>
-                                    <pic:cNvPicPr/>
-                                  </pic:nvPicPr>
-                                  <pic:blipFill>
-                                    <a:blip r:embed="rId5" cstate="print">
-                                      <a:extLst>
-                                        <a:ext uri="{28A0092B-C50C-407E-A947-70E740481C1C}">
-                                          <a14:useLocalDpi xmlns:a14="http://schemas.microsoft.com/office/drawing/2010/main" val="0"/>
-                                        </a:ext>
-                                      </a:extLst>
-                                    </a:blip>
-                                    <a:stretch>
-                                      <a:fillRect/>
-                                    </a:stretch>
-                                  </pic:blipFill>
-                                  <pic:spPr>
-                                    <a:xfrm>
-                                      <a:off x="0" y="0"/>
-                                      <a:ext cx="608225" cy="842157"/>
-                                    </a:xfrm>
-                                    <a:prstGeom prst="rect">
-                                      <a:avLst/>
-                                    </a:prstGeom>
-                                  </pic:spPr>
-                                </pic:pic>
-                              </a:graphicData>
-                            </a:graphic>
-                          </wp:inline>
-                        </w:drawing>
-                      </w:r>
-                    </w:p>
-                  </w:txbxContent>
-                </v:textbox>
-                <w10:wrap type="square"/>
-              </v:shape>
-            </w:pict>
-          </mc:Fallback>
-        </mc:AlternateContent>
-      </w:r>
-    </w:p>
-    <w:p>
-      <w:pPr>
-        <w:spacing w:before="219" w:line="271" w:lineRule="auto"/>
-        <w:ind w:left="160"/>
-        <w:rPr>
-          <w:noProof/>
-        </w:rPr>
-      </w:pPr>
     </w:p>
     <w:p>
       <w:pPr>

</xml_diff>

<commit_message>
fixed date error in invitations
</commit_message>
<xml_diff>
--- a/documents/invite50.docx
+++ b/documents/invite50.docx
@@ -375,7 +375,25 @@
         <w:rPr>
           <w:sz w:val="23"/>
         </w:rPr>
-        <w:t xml:space="preserve">April 28, </w:t>
+        <w:t>August</w:t>
+      </w:r>
+      <w:r>
+        <w:rPr>
+          <w:sz w:val="23"/>
+        </w:rPr>
+        <w:t xml:space="preserve"> 2</w:t>
+      </w:r>
+      <w:r>
+        <w:rPr>
+          <w:sz w:val="23"/>
+        </w:rPr>
+        <w:t>9</w:t>
+      </w:r>
+      <w:r>
+        <w:rPr>
+          <w:sz w:val="23"/>
+        </w:rPr>
+        <w:t xml:space="preserve">, </w:t>
       </w:r>
       <w:r>
         <w:rPr>
@@ -383,6 +401,13 @@
           <w:sz w:val="23"/>
         </w:rPr>
         <w:t>2026</w:t>
+      </w:r>
+      <w:r>
+        <w:rPr>
+          <w:spacing w:val="-4"/>
+          <w:sz w:val="23"/>
+        </w:rPr>
+        <w:t xml:space="preserve"> Saturday</w:t>
       </w:r>
     </w:p>
     <w:p>

</xml_diff>

<commit_message>
1) Updated deceased citation for Stekr. 2) Fixed error in contact link for André. 3) Fixed price for dinner ($60, not $50), and added a note about it.
</commit_message>
<xml_diff>
--- a/documents/invite50.docx
+++ b/documents/invite50.docx
@@ -666,7 +666,23 @@
           <w:color w:val="791D2B"/>
           <w:sz w:val="26"/>
         </w:rPr>
-        <w:t xml:space="preserve">Dinner &amp; Details — $50 per </w:t>
+        <w:t>Dinner &amp; Details — $</w:t>
+      </w:r>
+      <w:r>
+        <w:rPr>
+          <w:b/>
+          <w:color w:val="791D2B"/>
+          <w:sz w:val="26"/>
+        </w:rPr>
+        <w:t>6</w:t>
+      </w:r>
+      <w:r>
+        <w:rPr>
+          <w:b/>
+          <w:color w:val="791D2B"/>
+          <w:sz w:val="26"/>
+        </w:rPr>
+        <w:t xml:space="preserve">0 per </w:t>
       </w:r>
       <w:r>
         <w:rPr>

</xml_diff>